<commit_message>
fix: hyphenate across formatting runs
</commit_message>
<xml_diff>
--- a/parity/fixtures/word-hyphenation-hanging.docx
+++ b/parity/fixtures/word-hyphenation-hanging.docx
@@ -200,6 +200,38 @@
           <w:lang w:val="ja-JP" w:eastAsia="ja-JP"/>
         </w:rPr>
         <w:t>甲乙丙丁※甲乙丙丁※甲乙丙丁※甲乙丙丁</w:t>
+      </w:r>
+    </w:p>
+    <w:p>
+      <w:r>
+        <w:br w:type="page"/>
+      </w:r>
+    </w:p>
+    <w:p>
+      <w:r>
+        <w:rPr>
+          <w:b/>
+          <w:lang w:val="en-US"/>
+        </w:rPr>
+        <w:t>EN split formatting</w:t>
+      </w:r>
+    </w:p>
+    <w:p>
+      <w:pPr>
+        <w:ind w:right="6480"/>
+      </w:pPr>
+      <w:r>
+        <w:rPr>
+          <w:lang w:val="en-US"/>
+        </w:rPr>
+        <w:t xml:space="preserve">Representation internatio</w:t>
+      </w:r>
+      <w:r>
+        <w:rPr>
+          <w:color w:val="C00000"/>
+          <w:lang w:val="en-US"/>
+        </w:rPr>
+        <w:t>nalization characterization demonstration compatibility.</w:t>
       </w:r>
     </w:p>
     <w:sectPr>

</xml_diff>

<commit_message>
fix: honor custom kinsoku punctuation lists
</commit_message>
<xml_diff>
--- a/parity/fixtures/word-hyphenation-hanging.docx
+++ b/parity/fixtures/word-hyphenation-hanging.docx
@@ -232,6 +232,127 @@
           <w:lang w:val="en-US"/>
         </w:rPr>
         <w:t>nalization characterization demonstration compatibility.</w:t>
+      </w:r>
+    </w:p>
+    <w:p>
+      <w:r>
+        <w:br w:type="page"/>
+      </w:r>
+    </w:p>
+    <w:p>
+      <w:r>
+        <w:rPr>
+          <w:b/>
+          <w:lang w:val="en-US"/>
+        </w:rPr>
+        <w:t>Japanese overflow disabled</w:t>
+      </w:r>
+    </w:p>
+    <w:p>
+      <w:pPr>
+        <w:ind w:right="6500"/>
+        <w:kinsoku/>
+        <w:overflowPunct w:val="0"/>
+      </w:pPr>
+      <w:r>
+        <w:rPr>
+          <w:lang w:val="ja-JP" w:eastAsia="ja-JP"/>
+        </w:rPr>
+        <w:t>甲乙丙丁戊己庚辛壬癸子丑寅。甲乙丙丁</w:t>
+      </w:r>
+    </w:p>
+    <w:p>
+      <w:r>
+        <w:br w:type="page"/>
+      </w:r>
+    </w:p>
+    <w:p>
+      <w:r>
+        <w:rPr>
+          <w:b/>
+          <w:lang w:val="en-US"/>
+        </w:rPr>
+        <w:t>Japanese overflow enabled</w:t>
+      </w:r>
+    </w:p>
+    <w:p>
+      <w:pPr>
+        <w:ind w:right="6500"/>
+        <w:kinsoku/>
+        <w:overflowPunct/>
+      </w:pPr>
+      <w:r>
+        <w:rPr>
+          <w:lang w:val="ja-JP" w:eastAsia="ja-JP"/>
+        </w:rPr>
+        <w:t>甲乙丙丁戊己庚辛壬癸子丑寅。甲乙丙丁</w:t>
+      </w:r>
+    </w:p>
+    <w:p>
+      <w:r>
+        <w:br w:type="page"/>
+      </w:r>
+    </w:p>
+    <w:p>
+      <w:r>
+        <w:rPr>
+          <w:b/>
+          <w:lang w:val="en-US"/>
+        </w:rPr>
+        <w:t>Japanese closing pair</w:t>
+      </w:r>
+    </w:p>
+    <w:p>
+      <w:pPr>
+        <w:ind w:right="6500"/>
+        <w:kinsoku/>
+        <w:overflowPunct/>
+      </w:pPr>
+      <w:r>
+        <w:rPr>
+          <w:lang w:val="ja-JP" w:eastAsia="ja-JP"/>
+        </w:rPr>
+        <w:t>甲乙丙丁戊己庚辛壬癸子丑寅。」甲乙丙丁</w:t>
+      </w:r>
+    </w:p>
+    <w:p>
+      <w:r>
+        <w:br w:type="page"/>
+      </w:r>
+    </w:p>
+    <w:p>
+      <w:r>
+        <w:rPr>
+          <w:b/>
+          <w:lang w:val="en-US"/>
+        </w:rPr>
+        <w:t>Japanese split punctuation</w:t>
+      </w:r>
+    </w:p>
+    <w:p>
+      <w:pPr>
+        <w:ind w:right="6500"/>
+        <w:kinsoku/>
+        <w:overflowPunct/>
+      </w:pPr>
+      <w:r>
+        <w:rPr>
+          <w:lang w:val="ja-JP" w:eastAsia="ja-JP"/>
+        </w:rPr>
+        <w:t>甲乙丙丁戊己庚辛壬癸子丑寅</w:t>
+      </w:r>
+      <w:r>
+        <w:rPr>
+          <w:color w:val="C00000"/>
+          <w:lang w:val="ja-JP" w:eastAsia="ja-JP"/>
+        </w:rPr>
+        <w:t>。</w:t>
+      </w:r>
+      <w:r>
+        <w:rPr>
+          <w:lang w:val="ja-JP" w:eastAsia="ja-JP"/>
+        </w:rPr>
+        <w:t>甲乙丙丁</w:t>
       </w:r>
     </w:p>
     <w:sectPr>

</xml_diff>

<commit_message>
fix: tighten justified paragraph fitting (#336)
</commit_message>
<xml_diff>
--- a/parity/fixtures/word-hyphenation-hanging.docx
+++ b/parity/fixtures/word-hyphenation-hanging.docx
@@ -353,6 +353,213 @@
           <w:lang w:val="ja-JP" w:eastAsia="ja-JP"/>
         </w:rPr>
         <w:t>甲乙丙丁</w:t>
+      </w:r>
+    </w:p>
+    <w:p>
+      <w:r>
+        <w:br w:type="page"/>
+      </w:r>
+    </w:p>
+    <w:p>
+      <w:r>
+        <w:rPr>
+          <w:b/>
+          <w:lang w:val="en-US"/>
+        </w:rPr>
+        <w:t>Justified common paragraph</w:t>
+      </w:r>
+    </w:p>
+    <w:p>
+      <w:pPr>
+        <w:suppressAutoHyphens/>
+        <w:ind w:right="3600"/>
+        <w:jc w:val="both"/>
+      </w:pPr>
+      <w:r>
+        <w:t>Contract clauses allocate risk between parties and describe notice requirements, payment timing, remedies, and termination rights.</w:t>
+      </w:r>
+    </w:p>
+    <w:p>
+      <w:r>
+        <w:br w:type="page"/>
+      </w:r>
+    </w:p>
+    <w:p>
+      <w:r>
+        <w:rPr>
+          <w:b/>
+          <w:lang w:val="en-US"/>
+        </w:rPr>
+        <w:t>First-line paragraph indent</w:t>
+      </w:r>
+    </w:p>
+    <w:p>
+      <w:pPr>
+        <w:suppressAutoHyphens/>
+        <w:ind w:left="720" w:right="3600" w:firstLine="720"/>
+      </w:pPr>
+      <w:r>
+        <w:t>Contract clauses allocate risk between parties and describe notice requirements, payment timing, remedies, and termination rights.</w:t>
+      </w:r>
+    </w:p>
+    <w:p>
+      <w:r>
+        <w:br w:type="page"/>
+      </w:r>
+    </w:p>
+    <w:p>
+      <w:r>
+        <w:rPr>
+          <w:b/>
+          <w:lang w:val="en-US"/>
+        </w:rPr>
+        <w:t>Explicit tab stops</w:t>
+      </w:r>
+    </w:p>
+    <w:p>
+      <w:pPr>
+        <w:suppressAutoHyphens/>
+        <w:ind w:right="2880"/>
+        <w:tabs>
+          <w:tab w:val="left" w:pos="1440"/>
+          <w:tab w:val="right" w:pos="5760"/>
+        </w:tabs>
+      </w:pPr>
+      <w:r>
+        <w:t>Service item</w:t>
+        <w:tab/>
+        <w:t>Annual renewal and support plan</w:t>
+        <w:tab/>
+        <w:t>1,250.00</w:t>
+      </w:r>
+    </w:p>
+    <w:p>
+      <w:r>
+        <w:br w:type="page"/>
+      </w:r>
+    </w:p>
+    <w:p>
+      <w:r>
+        <w:rPr>
+          <w:b/>
+          <w:lang w:val="en-US"/>
+        </w:rPr>
+        <w:t>Wrapped numbered item</w:t>
+      </w:r>
+    </w:p>
+    <w:p>
+      <w:pPr>
+        <w:suppressAutoHyphens/>
+        <w:ind w:right="3600"/>
+        <w:numPr>
+          <w:ilvl w:val="0"/>
+          <w:numId w:val="1"/>
+        </w:numPr>
+      </w:pPr>
+      <w:r>
+        <w:t>The supplier must preserve records, provide audit access, and notify the customer before deleting retained material.</w:t>
+      </w:r>
+    </w:p>
+    <w:p>
+      <w:r>
+        <w:br w:type="page"/>
+      </w:r>
+    </w:p>
+    <w:p>
+      <w:r>
+        <w:rPr>
+          <w:b/>
+          <w:lang w:val="en-US"/>
+        </w:rPr>
+        <w:t>Constrained table cell</w:t>
+      </w:r>
+    </w:p>
+    <w:tbl>
+      <w:tblPr>
+        <w:tblW w:w="4320" w:type="dxa"/>
+        <w:tblLayout w:type="fixed"/>
+      </w:tblPr>
+      <w:tblGrid>
+        <w:gridCol w:w="4320"/>
+      </w:tblGrid>
+      <w:tr>
+        <w:tc>
+          <w:tcPr>
+            <w:tcW w:w="4320" w:type="dxa"/>
+          </w:tcPr>
+          <w:p>
+            <w:pPr>
+              <w:suppressAutoHyphens/>
+            </w:pPr>
+            <w:r>
+              <w:t>Payment is due within thirty days after receipt of a valid invoice and supporting records.</w:t>
+            </w:r>
+          </w:p>
+        </w:tc>
+      </w:tr>
+    </w:tbl>
+    <w:p>
+      <w:r>
+        <w:br w:type="page"/>
+      </w:r>
+    </w:p>
+    <w:p>
+      <w:r>
+        <w:rPr>
+          <w:b/>
+          <w:lang w:val="en-US"/>
+        </w:rPr>
+        <w:t>Mixed emphasis runs</w:t>
+      </w:r>
+    </w:p>
+    <w:p>
+      <w:pPr>
+        <w:suppressAutoHyphens/>
+        <w:ind w:right="4320"/>
+      </w:pPr>
+      <w:r>
+        <w:t xml:space="preserve">The agreement requires </w:t>
+      </w:r>
+      <w:r>
+        <w:rPr>
+          <w:b/>
+        </w:rPr>
+        <w:t>written notice</w:t>
+      </w:r>
+      <w:r>
+        <w:t xml:space="preserve"> before either party may </w:t>
+      </w:r>
+      <w:r>
+        <w:rPr>
+          <w:i/>
+        </w:rPr>
+        <w:t>terminate for convenience</w:t>
+      </w:r>
+      <w:r>
+        <w:t>. Additional obligations continue.</w:t>
+      </w:r>
+    </w:p>
+    <w:p>
+      <w:r>
+        <w:br w:type="page"/>
+      </w:r>
+    </w:p>
+    <w:p>
+      <w:r>
+        <w:rPr>
+          <w:b/>
+          <w:lang w:val="en-US"/>
+        </w:rPr>
+        <w:t>Left-aligned control paragraph</w:t>
+      </w:r>
+    </w:p>
+    <w:p>
+      <w:pPr>
+        <w:suppressAutoHyphens/>
+        <w:ind w:right="3600"/>
+      </w:pPr>
+      <w:r>
+        <w:t>Contract clauses allocate risk between parties and describe notice requirements, payment timing, remedies, and termination rights.</w:t>
       </w:r>
     </w:p>
     <w:sectPr>
@@ -361,6 +568,29 @@
     </w:sectPr>
   </w:body>
 </w:document>
+</file>
+
+<file path=word/numbering.xml><?xml version="1.0" encoding="utf-8"?>
+<w:numbering xmlns:w="http://schemas.openxmlformats.org/wordprocessingml/2006/main">
+  <w:abstractNum w:abstractNumId="0">
+    <w:multiLevelType w:val="singleLevel"/>
+    <w:lvl w:ilvl="0">
+      <w:start w:val="1"/>
+      <w:numFmt w:val="decimal"/>
+      <w:lvlText w:val="%1."/>
+      <w:lvlJc w:val="left"/>
+      <w:pPr>
+        <w:tabs>
+          <w:tab w:val="num" w:pos="720"/>
+        </w:tabs>
+        <w:ind w:left="720" w:hanging="360"/>
+      </w:pPr>
+    </w:lvl>
+  </w:abstractNum>
+  <w:num w:numId="1">
+    <w:abstractNumId w:val="0"/>
+  </w:num>
+</w:numbering>
 </file>
 
 <file path=word/styles.xml><?xml version="1.0" encoding="utf-8"?>

</xml_diff>